<commit_message>
quality report of missing variables in 2015 data set checking about at least one variable was missing
</commit_message>
<xml_diff>
--- a/notebooks/2015_Birth/First stage 2015/01_missing_values_analysis.docx
+++ b/notebooks/2015_Birth/First stage 2015/01_missing_values_analysis.docx
@@ -13,7 +13,7 @@
     </w:p>
     <w:p>
       <w:r>
-        <w:t>Generated: 2026-03-21 10:59</w:t>
+        <w:t>Generated: 2026-04-01 18:15</w:t>
       </w:r>
     </w:p>
     <w:p>
@@ -36,13 +36,13 @@
         <w:br/>
         <w:t>Key findings include:</w:t>
         <w:br/>
-        <w:t>• Total missing values: 366,219 (6.05% of all data)</w:t>
+        <w:t>• Total missing values: 33,826 (0.56% of all data)</w:t>
         <w:br/>
-        <w:t>• Columns with missing data: 4 out of 18 columns</w:t>
+        <w:t>• Columns with missing data: 3 out of 18 columns</w:t>
         <w:br/>
-        <w:t>• Columns with &gt;20% missing data: 1</w:t>
+        <w:t>• Columns with &gt;20% missing data: 0</w:t>
         <w:br/>
-        <w:t>• Best completed columns: ['Registered_Month', 'Registered_Year', 'Registered_Year 2.0']</w:t>
+        <w:t>• Best completed columns: ['Registered_Year', 'Registered_Month', 'Registered_Year 2.0']</w:t>
       </w:r>
     </w:p>
     <w:p>
@@ -168,7 +168,7 @@
               <w:jc w:val="right"/>
             </w:pPr>
             <w:r>
-              <w:t>4.0</w:t>
+              <w:t>3.0</w:t>
             </w:r>
           </w:p>
         </w:tc>
@@ -193,7 +193,7 @@
               <w:jc w:val="right"/>
             </w:pPr>
             <w:r>
-              <w:t>366219.0</w:t>
+              <w:t>33826.0</w:t>
             </w:r>
           </w:p>
         </w:tc>
@@ -218,7 +218,7 @@
               <w:jc w:val="right"/>
             </w:pPr>
             <w:r>
-              <w:t>6.05</w:t>
+              <w:t>0.56</w:t>
             </w:r>
           </w:p>
         </w:tc>
@@ -363,93 +363,6 @@
                 <w:b/>
               </w:rPr>
               <w:t>Completion %</w:t>
-            </w:r>
-          </w:p>
-        </w:tc>
-      </w:tr>
-      <w:tr>
-        <w:tc>
-          <w:tcPr>
-            <w:tcW w:type="dxa" w:w="1234"/>
-          </w:tcPr>
-          <w:p>
-            <w:r>
-              <w:t>Multiple_Birth_Status</w:t>
-            </w:r>
-          </w:p>
-        </w:tc>
-        <w:tc>
-          <w:tcPr>
-            <w:tcW w:type="dxa" w:w="1234"/>
-          </w:tcPr>
-          <w:p>
-            <w:pPr>
-              <w:jc w:val="right"/>
-            </w:pPr>
-            <w:r>
-              <w:t>332,393</w:t>
-            </w:r>
-          </w:p>
-        </w:tc>
-        <w:tc>
-          <w:tcPr>
-            <w:tcW w:type="dxa" w:w="1234"/>
-          </w:tcPr>
-          <w:p>
-            <w:pPr>
-              <w:jc w:val="right"/>
-            </w:pPr>
-            <w:r>
-              <w:t>98.9%</w:t>
-            </w:r>
-          </w:p>
-        </w:tc>
-        <w:tc>
-          <w:tcPr>
-            <w:tcW w:type="dxa" w:w="1234"/>
-          </w:tcPr>
-          <w:p>
-            <w:r>
-              <w:t>str</w:t>
-            </w:r>
-          </w:p>
-        </w:tc>
-        <w:tc>
-          <w:tcPr>
-            <w:tcW w:type="dxa" w:w="1234"/>
-          </w:tcPr>
-          <w:p>
-            <w:pPr>
-              <w:jc w:val="right"/>
-            </w:pPr>
-            <w:r>
-              <w:t>3</w:t>
-            </w:r>
-          </w:p>
-        </w:tc>
-        <w:tc>
-          <w:tcPr>
-            <w:tcW w:type="dxa" w:w="1234"/>
-          </w:tcPr>
-          <w:p>
-            <w:pPr>
-              <w:jc w:val="right"/>
-            </w:pPr>
-            <w:r>
-              <w:t>3,704</w:t>
-            </w:r>
-          </w:p>
-        </w:tc>
-        <w:tc>
-          <w:tcPr>
-            <w:tcW w:type="dxa" w:w="1234"/>
-          </w:tcPr>
-          <w:p>
-            <w:pPr>
-              <w:jc w:val="right"/>
-            </w:pPr>
-            <w:r>
-              <w:t>1.1%</w:t>
             </w:r>
           </w:p>
         </w:tc>
@@ -722,6 +635,93 @@
           </w:tcPr>
           <w:p>
             <w:r>
+              <w:t>Registered_Year</w:t>
+            </w:r>
+          </w:p>
+        </w:tc>
+        <w:tc>
+          <w:tcPr>
+            <w:tcW w:type="dxa" w:w="1234"/>
+          </w:tcPr>
+          <w:p>
+            <w:pPr>
+              <w:jc w:val="right"/>
+            </w:pPr>
+            <w:r>
+              <w:t>0</w:t>
+            </w:r>
+          </w:p>
+        </w:tc>
+        <w:tc>
+          <w:tcPr>
+            <w:tcW w:type="dxa" w:w="1234"/>
+          </w:tcPr>
+          <w:p>
+            <w:pPr>
+              <w:jc w:val="right"/>
+            </w:pPr>
+            <w:r>
+              <w:t>0.0%</w:t>
+            </w:r>
+          </w:p>
+        </w:tc>
+        <w:tc>
+          <w:tcPr>
+            <w:tcW w:type="dxa" w:w="1234"/>
+          </w:tcPr>
+          <w:p>
+            <w:r>
+              <w:t>int64</w:t>
+            </w:r>
+          </w:p>
+        </w:tc>
+        <w:tc>
+          <w:tcPr>
+            <w:tcW w:type="dxa" w:w="1234"/>
+          </w:tcPr>
+          <w:p>
+            <w:pPr>
+              <w:jc w:val="right"/>
+            </w:pPr>
+            <w:r>
+              <w:t>1</w:t>
+            </w:r>
+          </w:p>
+        </w:tc>
+        <w:tc>
+          <w:tcPr>
+            <w:tcW w:type="dxa" w:w="1234"/>
+          </w:tcPr>
+          <w:p>
+            <w:pPr>
+              <w:jc w:val="right"/>
+            </w:pPr>
+            <w:r>
+              <w:t>336,097</w:t>
+            </w:r>
+          </w:p>
+        </w:tc>
+        <w:tc>
+          <w:tcPr>
+            <w:tcW w:type="dxa" w:w="1234"/>
+          </w:tcPr>
+          <w:p>
+            <w:pPr>
+              <w:jc w:val="right"/>
+            </w:pPr>
+            <w:r>
+              <w:t>100.0%</w:t>
+            </w:r>
+          </w:p>
+        </w:tc>
+      </w:tr>
+      <w:tr>
+        <w:tc>
+          <w:tcPr>
+            <w:tcW w:type="dxa" w:w="1234"/>
+          </w:tcPr>
+          <w:p>
+            <w:r>
               <w:t>Registered_Month</w:t>
             </w:r>
           </w:p>
@@ -809,7 +809,7 @@
           </w:tcPr>
           <w:p>
             <w:r>
-              <w:t>Registered_Year</w:t>
+              <w:t>Registered_Year 2.0</w:t>
             </w:r>
           </w:p>
         </w:tc>
@@ -896,7 +896,7 @@
           </w:tcPr>
           <w:p>
             <w:r>
-              <w:t>Registered_Year 2.0</w:t>
+              <w:t>Birth_Year_2.0</w:t>
             </w:r>
           </w:p>
         </w:tc>
@@ -945,7 +945,7 @@
               <w:jc w:val="right"/>
             </w:pPr>
             <w:r>
-              <w:t>1</w:t>
+              <w:t>60</w:t>
             </w:r>
           </w:p>
         </w:tc>
@@ -1505,7 +1505,7 @@
           </w:tcPr>
           <w:p>
             <w:r>
-              <w:t>Birth_Year_2.0</w:t>
+              <w:t>Multiple_Birth_Status</w:t>
             </w:r>
           </w:p>
         </w:tc>
@@ -1541,7 +1541,7 @@
           </w:tcPr>
           <w:p>
             <w:r>
-              <w:t>int64</w:t>
+              <w:t>str</w:t>
             </w:r>
           </w:p>
         </w:tc>
@@ -1554,7 +1554,7 @@
               <w:jc w:val="right"/>
             </w:pPr>
             <w:r>
-              <w:t>60</w:t>
+              <w:t>4</w:t>
             </w:r>
           </w:p>
         </w:tc>
@@ -2103,7 +2103,7 @@
       <w:jc w:val="center"/>
     </w:pPr>
     <w:r>
-      <w:t xml:space="preserve">Missing Values Analysis | Generated: 2026-03-21 | Page </w:t>
+      <w:t xml:space="preserve">Missing Values Analysis | Generated: 2026-04-01 | Page </w:t>
     </w:r>
     <w:r>
       <w:fldChar w:fldCharType="begin"/>

</xml_diff>

<commit_message>
creating complete data files 2015
</commit_message>
<xml_diff>
--- a/notebooks/2015_Birth/First stage 2015/01_missing_values_analysis.docx
+++ b/notebooks/2015_Birth/First stage 2015/01_missing_values_analysis.docx
@@ -13,12 +13,12 @@
     </w:p>
     <w:p>
       <w:r>
-        <w:t>Generated: 2026-04-01 18:15</w:t>
+        <w:t>Generated: 2026-04-30 23:22</w:t>
       </w:r>
     </w:p>
     <w:p>
       <w:r>
-        <w:t>Dataset: 336,097 rows × 18 columns</w:t>
+        <w:t>Dataset: 336,097 rows × 17 columns</w:t>
       </w:r>
     </w:p>
     <w:p/>
@@ -36,13 +36,13 @@
         <w:br/>
         <w:t>Key findings include:</w:t>
         <w:br/>
-        <w:t>• Total missing values: 33,826 (0.56% of all data)</w:t>
+        <w:t>• Total missing values: 34,805 (0.61% of all data)</w:t>
         <w:br/>
-        <w:t>• Columns with missing data: 3 out of 18 columns</w:t>
+        <w:t>• Columns with missing data: 17 out of 17 columns</w:t>
         <w:br/>
         <w:t>• Columns with &gt;20% missing data: 0</w:t>
         <w:br/>
-        <w:t>• Best completed columns: ['Registered_Year', 'Registered_Month', 'Registered_Year 2.0']</w:t>
+        <w:t>• Best completed columns: ['Registered_Year', 'Registered_Month', 'Birth_Month']</w:t>
       </w:r>
     </w:p>
     <w:p>
@@ -143,7 +143,7 @@
               <w:jc w:val="right"/>
             </w:pPr>
             <w:r>
-              <w:t>18.0</w:t>
+              <w:t>17.0</w:t>
             </w:r>
           </w:p>
         </w:tc>
@@ -168,7 +168,7 @@
               <w:jc w:val="right"/>
             </w:pPr>
             <w:r>
-              <w:t>3.0</w:t>
+              <w:t>17.0</w:t>
             </w:r>
           </w:p>
         </w:tc>
@@ -193,7 +193,7 @@
               <w:jc w:val="right"/>
             </w:pPr>
             <w:r>
-              <w:t>33826.0</w:t>
+              <w:t>34805.0</w:t>
             </w:r>
           </w:p>
         </w:tc>
@@ -218,7 +218,7 @@
               <w:jc w:val="right"/>
             </w:pPr>
             <w:r>
-              <w:t>0.56</w:t>
+              <w:t>0.61</w:t>
             </w:r>
           </w:p>
         </w:tc>
@@ -387,7 +387,7 @@
               <w:jc w:val="right"/>
             </w:pPr>
             <w:r>
-              <w:t>33,604</w:t>
+              <w:t>33,639</w:t>
             </w:r>
           </w:p>
         </w:tc>
@@ -436,7 +436,7 @@
               <w:jc w:val="right"/>
             </w:pPr>
             <w:r>
-              <w:t>302,493</w:t>
+              <w:t>302,458</w:t>
             </w:r>
           </w:p>
         </w:tc>
@@ -474,7 +474,7 @@
               <w:jc w:val="right"/>
             </w:pPr>
             <w:r>
-              <w:t>221</w:t>
+              <w:t>280</w:t>
             </w:r>
           </w:p>
         </w:tc>
@@ -523,7 +523,7 @@
               <w:jc w:val="right"/>
             </w:pPr>
             <w:r>
-              <w:t>335,876</w:t>
+              <w:t>335,817</w:t>
             </w:r>
           </w:p>
         </w:tc>
@@ -561,7 +561,7 @@
               <w:jc w:val="right"/>
             </w:pPr>
             <w:r>
-              <w:t>1</w:t>
+              <w:t>60</w:t>
             </w:r>
           </w:p>
         </w:tc>
@@ -610,7 +610,7 @@
               <w:jc w:val="right"/>
             </w:pPr>
             <w:r>
-              <w:t>336,096</w:t>
+              <w:t>336,037</w:t>
             </w:r>
           </w:p>
         </w:tc>
@@ -648,7 +648,7 @@
               <w:jc w:val="right"/>
             </w:pPr>
             <w:r>
-              <w:t>0</w:t>
+              <w:t>59</w:t>
             </w:r>
           </w:p>
         </w:tc>
@@ -671,7 +671,7 @@
           </w:tcPr>
           <w:p>
             <w:r>
-              <w:t>int64</w:t>
+              <w:t>float64</w:t>
             </w:r>
           </w:p>
         </w:tc>
@@ -697,7 +697,7 @@
               <w:jc w:val="right"/>
             </w:pPr>
             <w:r>
-              <w:t>336,097</w:t>
+              <w:t>336,038</w:t>
             </w:r>
           </w:p>
         </w:tc>
@@ -735,7 +735,7 @@
               <w:jc w:val="right"/>
             </w:pPr>
             <w:r>
-              <w:t>0</w:t>
+              <w:t>59</w:t>
             </w:r>
           </w:p>
         </w:tc>
@@ -784,7 +784,7 @@
               <w:jc w:val="right"/>
             </w:pPr>
             <w:r>
-              <w:t>336,097</w:t>
+              <w:t>336,038</w:t>
             </w:r>
           </w:p>
         </w:tc>
@@ -809,7 +809,7 @@
           </w:tcPr>
           <w:p>
             <w:r>
-              <w:t>Registered_Year 2.0</w:t>
+              <w:t>Birth_Month</w:t>
             </w:r>
           </w:p>
         </w:tc>
@@ -822,7 +822,7 @@
               <w:jc w:val="right"/>
             </w:pPr>
             <w:r>
-              <w:t>0</w:t>
+              <w:t>59</w:t>
             </w:r>
           </w:p>
         </w:tc>
@@ -845,7 +845,7 @@
           </w:tcPr>
           <w:p>
             <w:r>
-              <w:t>int64</w:t>
+              <w:t>str</w:t>
             </w:r>
           </w:p>
         </w:tc>
@@ -858,7 +858,7 @@
               <w:jc w:val="right"/>
             </w:pPr>
             <w:r>
-              <w:t>1</w:t>
+              <w:t>12</w:t>
             </w:r>
           </w:p>
         </w:tc>
@@ -871,94 +871,7 @@
               <w:jc w:val="right"/>
             </w:pPr>
             <w:r>
-              <w:t>336,097</w:t>
-            </w:r>
-          </w:p>
-        </w:tc>
-        <w:tc>
-          <w:tcPr>
-            <w:tcW w:type="dxa" w:w="1234"/>
-          </w:tcPr>
-          <w:p>
-            <w:pPr>
-              <w:jc w:val="right"/>
-            </w:pPr>
-            <w:r>
-              <w:t>100.0%</w:t>
-            </w:r>
-          </w:p>
-        </w:tc>
-      </w:tr>
-      <w:tr>
-        <w:tc>
-          <w:tcPr>
-            <w:tcW w:type="dxa" w:w="1234"/>
-          </w:tcPr>
-          <w:p>
-            <w:r>
-              <w:t>Birth_Year_2.0</w:t>
-            </w:r>
-          </w:p>
-        </w:tc>
-        <w:tc>
-          <w:tcPr>
-            <w:tcW w:type="dxa" w:w="1234"/>
-          </w:tcPr>
-          <w:p>
-            <w:pPr>
-              <w:jc w:val="right"/>
-            </w:pPr>
-            <w:r>
-              <w:t>0</w:t>
-            </w:r>
-          </w:p>
-        </w:tc>
-        <w:tc>
-          <w:tcPr>
-            <w:tcW w:type="dxa" w:w="1234"/>
-          </w:tcPr>
-          <w:p>
-            <w:pPr>
-              <w:jc w:val="right"/>
-            </w:pPr>
-            <w:r>
-              <w:t>0.0%</w:t>
-            </w:r>
-          </w:p>
-        </w:tc>
-        <w:tc>
-          <w:tcPr>
-            <w:tcW w:type="dxa" w:w="1234"/>
-          </w:tcPr>
-          <w:p>
-            <w:r>
-              <w:t>int64</w:t>
-            </w:r>
-          </w:p>
-        </w:tc>
-        <w:tc>
-          <w:tcPr>
-            <w:tcW w:type="dxa" w:w="1234"/>
-          </w:tcPr>
-          <w:p>
-            <w:pPr>
-              <w:jc w:val="right"/>
-            </w:pPr>
-            <w:r>
-              <w:t>60</w:t>
-            </w:r>
-          </w:p>
-        </w:tc>
-        <w:tc>
-          <w:tcPr>
-            <w:tcW w:type="dxa" w:w="1234"/>
-          </w:tcPr>
-          <w:p>
-            <w:pPr>
-              <w:jc w:val="right"/>
-            </w:pPr>
-            <w:r>
-              <w:t>336,097</w:t>
+              <w:t>336,038</w:t>
             </w:r>
           </w:p>
         </w:tc>
@@ -996,7 +909,7 @@
               <w:jc w:val="right"/>
             </w:pPr>
             <w:r>
-              <w:t>0</w:t>
+              <w:t>59</w:t>
             </w:r>
           </w:p>
         </w:tc>
@@ -1045,7 +958,7 @@
               <w:jc w:val="right"/>
             </w:pPr>
             <w:r>
-              <w:t>336,097</w:t>
+              <w:t>336,038</w:t>
             </w:r>
           </w:p>
         </w:tc>
@@ -1083,7 +996,7 @@
               <w:jc w:val="right"/>
             </w:pPr>
             <w:r>
-              <w:t>0</w:t>
+              <w:t>59</w:t>
             </w:r>
           </w:p>
         </w:tc>
@@ -1106,7 +1019,7 @@
           </w:tcPr>
           <w:p>
             <w:r>
-              <w:t>int64</w:t>
+              <w:t>float64</w:t>
             </w:r>
           </w:p>
         </w:tc>
@@ -1132,7 +1045,7 @@
               <w:jc w:val="right"/>
             </w:pPr>
             <w:r>
-              <w:t>336,097</w:t>
+              <w:t>336,038</w:t>
             </w:r>
           </w:p>
         </w:tc>
@@ -1157,7 +1070,7 @@
           </w:tcPr>
           <w:p>
             <w:r>
-              <w:t>Birth_Month</w:t>
+              <w:t>Birh_Year 2.0</w:t>
             </w:r>
           </w:p>
         </w:tc>
@@ -1170,7 +1083,703 @@
               <w:jc w:val="right"/>
             </w:pPr>
             <w:r>
-              <w:t>0</w:t>
+              <w:t>59</w:t>
+            </w:r>
+          </w:p>
+        </w:tc>
+        <w:tc>
+          <w:tcPr>
+            <w:tcW w:type="dxa" w:w="1234"/>
+          </w:tcPr>
+          <w:p>
+            <w:pPr>
+              <w:jc w:val="right"/>
+            </w:pPr>
+            <w:r>
+              <w:t>0.0%</w:t>
+            </w:r>
+          </w:p>
+        </w:tc>
+        <w:tc>
+          <w:tcPr>
+            <w:tcW w:type="dxa" w:w="1234"/>
+          </w:tcPr>
+          <w:p>
+            <w:r>
+              <w:t>float64</w:t>
+            </w:r>
+          </w:p>
+        </w:tc>
+        <w:tc>
+          <w:tcPr>
+            <w:tcW w:type="dxa" w:w="1234"/>
+          </w:tcPr>
+          <w:p>
+            <w:pPr>
+              <w:jc w:val="right"/>
+            </w:pPr>
+            <w:r>
+              <w:t>60</w:t>
+            </w:r>
+          </w:p>
+        </w:tc>
+        <w:tc>
+          <w:tcPr>
+            <w:tcW w:type="dxa" w:w="1234"/>
+          </w:tcPr>
+          <w:p>
+            <w:pPr>
+              <w:jc w:val="right"/>
+            </w:pPr>
+            <w:r>
+              <w:t>336,038</w:t>
+            </w:r>
+          </w:p>
+        </w:tc>
+        <w:tc>
+          <w:tcPr>
+            <w:tcW w:type="dxa" w:w="1234"/>
+          </w:tcPr>
+          <w:p>
+            <w:pPr>
+              <w:jc w:val="right"/>
+            </w:pPr>
+            <w:r>
+              <w:t>100.0%</w:t>
+            </w:r>
+          </w:p>
+        </w:tc>
+      </w:tr>
+      <w:tr>
+        <w:tc>
+          <w:tcPr>
+            <w:tcW w:type="dxa" w:w="1234"/>
+          </w:tcPr>
+          <w:p>
+            <w:r>
+              <w:t>Twin</w:t>
+            </w:r>
+          </w:p>
+        </w:tc>
+        <w:tc>
+          <w:tcPr>
+            <w:tcW w:type="dxa" w:w="1234"/>
+          </w:tcPr>
+          <w:p>
+            <w:pPr>
+              <w:jc w:val="right"/>
+            </w:pPr>
+            <w:r>
+              <w:t>59</w:t>
+            </w:r>
+          </w:p>
+        </w:tc>
+        <w:tc>
+          <w:tcPr>
+            <w:tcW w:type="dxa" w:w="1234"/>
+          </w:tcPr>
+          <w:p>
+            <w:pPr>
+              <w:jc w:val="right"/>
+            </w:pPr>
+            <w:r>
+              <w:t>0.0%</w:t>
+            </w:r>
+          </w:p>
+        </w:tc>
+        <w:tc>
+          <w:tcPr>
+            <w:tcW w:type="dxa" w:w="1234"/>
+          </w:tcPr>
+          <w:p>
+            <w:r>
+              <w:t>float64</w:t>
+            </w:r>
+          </w:p>
+        </w:tc>
+        <w:tc>
+          <w:tcPr>
+            <w:tcW w:type="dxa" w:w="1234"/>
+          </w:tcPr>
+          <w:p>
+            <w:pPr>
+              <w:jc w:val="right"/>
+            </w:pPr>
+            <w:r>
+              <w:t>4</w:t>
+            </w:r>
+          </w:p>
+        </w:tc>
+        <w:tc>
+          <w:tcPr>
+            <w:tcW w:type="dxa" w:w="1234"/>
+          </w:tcPr>
+          <w:p>
+            <w:pPr>
+              <w:jc w:val="right"/>
+            </w:pPr>
+            <w:r>
+              <w:t>336,038</w:t>
+            </w:r>
+          </w:p>
+        </w:tc>
+        <w:tc>
+          <w:tcPr>
+            <w:tcW w:type="dxa" w:w="1234"/>
+          </w:tcPr>
+          <w:p>
+            <w:pPr>
+              <w:jc w:val="right"/>
+            </w:pPr>
+            <w:r>
+              <w:t>100.0%</w:t>
+            </w:r>
+          </w:p>
+        </w:tc>
+      </w:tr>
+      <w:tr>
+        <w:tc>
+          <w:tcPr>
+            <w:tcW w:type="dxa" w:w="1234"/>
+          </w:tcPr>
+          <w:p>
+            <w:r>
+              <w:t>Hospital or Not</w:t>
+            </w:r>
+          </w:p>
+        </w:tc>
+        <w:tc>
+          <w:tcPr>
+            <w:tcW w:type="dxa" w:w="1234"/>
+          </w:tcPr>
+          <w:p>
+            <w:pPr>
+              <w:jc w:val="right"/>
+            </w:pPr>
+            <w:r>
+              <w:t>59</w:t>
+            </w:r>
+          </w:p>
+        </w:tc>
+        <w:tc>
+          <w:tcPr>
+            <w:tcW w:type="dxa" w:w="1234"/>
+          </w:tcPr>
+          <w:p>
+            <w:pPr>
+              <w:jc w:val="right"/>
+            </w:pPr>
+            <w:r>
+              <w:t>0.0%</w:t>
+            </w:r>
+          </w:p>
+        </w:tc>
+        <w:tc>
+          <w:tcPr>
+            <w:tcW w:type="dxa" w:w="1234"/>
+          </w:tcPr>
+          <w:p>
+            <w:r>
+              <w:t>str</w:t>
+            </w:r>
+          </w:p>
+        </w:tc>
+        <w:tc>
+          <w:tcPr>
+            <w:tcW w:type="dxa" w:w="1234"/>
+          </w:tcPr>
+          <w:p>
+            <w:pPr>
+              <w:jc w:val="right"/>
+            </w:pPr>
+            <w:r>
+              <w:t>2</w:t>
+            </w:r>
+          </w:p>
+        </w:tc>
+        <w:tc>
+          <w:tcPr>
+            <w:tcW w:type="dxa" w:w="1234"/>
+          </w:tcPr>
+          <w:p>
+            <w:pPr>
+              <w:jc w:val="right"/>
+            </w:pPr>
+            <w:r>
+              <w:t>336,038</w:t>
+            </w:r>
+          </w:p>
+        </w:tc>
+        <w:tc>
+          <w:tcPr>
+            <w:tcW w:type="dxa" w:w="1234"/>
+          </w:tcPr>
+          <w:p>
+            <w:pPr>
+              <w:jc w:val="right"/>
+            </w:pPr>
+            <w:r>
+              <w:t>100.0%</w:t>
+            </w:r>
+          </w:p>
+        </w:tc>
+      </w:tr>
+      <w:tr>
+        <w:tc>
+          <w:tcPr>
+            <w:tcW w:type="dxa" w:w="1234"/>
+          </w:tcPr>
+          <w:p>
+            <w:r>
+              <w:t xml:space="preserve">Gender </w:t>
+            </w:r>
+          </w:p>
+        </w:tc>
+        <w:tc>
+          <w:tcPr>
+            <w:tcW w:type="dxa" w:w="1234"/>
+          </w:tcPr>
+          <w:p>
+            <w:pPr>
+              <w:jc w:val="right"/>
+            </w:pPr>
+            <w:r>
+              <w:t>59</w:t>
+            </w:r>
+          </w:p>
+        </w:tc>
+        <w:tc>
+          <w:tcPr>
+            <w:tcW w:type="dxa" w:w="1234"/>
+          </w:tcPr>
+          <w:p>
+            <w:pPr>
+              <w:jc w:val="right"/>
+            </w:pPr>
+            <w:r>
+              <w:t>0.0%</w:t>
+            </w:r>
+          </w:p>
+        </w:tc>
+        <w:tc>
+          <w:tcPr>
+            <w:tcW w:type="dxa" w:w="1234"/>
+          </w:tcPr>
+          <w:p>
+            <w:r>
+              <w:t>str</w:t>
+            </w:r>
+          </w:p>
+        </w:tc>
+        <w:tc>
+          <w:tcPr>
+            <w:tcW w:type="dxa" w:w="1234"/>
+          </w:tcPr>
+          <w:p>
+            <w:pPr>
+              <w:jc w:val="right"/>
+            </w:pPr>
+            <w:r>
+              <w:t>2</w:t>
+            </w:r>
+          </w:p>
+        </w:tc>
+        <w:tc>
+          <w:tcPr>
+            <w:tcW w:type="dxa" w:w="1234"/>
+          </w:tcPr>
+          <w:p>
+            <w:pPr>
+              <w:jc w:val="right"/>
+            </w:pPr>
+            <w:r>
+              <w:t>336,038</w:t>
+            </w:r>
+          </w:p>
+        </w:tc>
+        <w:tc>
+          <w:tcPr>
+            <w:tcW w:type="dxa" w:w="1234"/>
+          </w:tcPr>
+          <w:p>
+            <w:pPr>
+              <w:jc w:val="right"/>
+            </w:pPr>
+            <w:r>
+              <w:t>100.0%</w:t>
+            </w:r>
+          </w:p>
+        </w:tc>
+      </w:tr>
+      <w:tr>
+        <w:tc>
+          <w:tcPr>
+            <w:tcW w:type="dxa" w:w="1234"/>
+          </w:tcPr>
+          <w:p>
+            <w:r>
+              <w:t>Multiple_Birth_Status</w:t>
+            </w:r>
+          </w:p>
+        </w:tc>
+        <w:tc>
+          <w:tcPr>
+            <w:tcW w:type="dxa" w:w="1234"/>
+          </w:tcPr>
+          <w:p>
+            <w:pPr>
+              <w:jc w:val="right"/>
+            </w:pPr>
+            <w:r>
+              <w:t>59</w:t>
+            </w:r>
+          </w:p>
+        </w:tc>
+        <w:tc>
+          <w:tcPr>
+            <w:tcW w:type="dxa" w:w="1234"/>
+          </w:tcPr>
+          <w:p>
+            <w:pPr>
+              <w:jc w:val="right"/>
+            </w:pPr>
+            <w:r>
+              <w:t>0.0%</w:t>
+            </w:r>
+          </w:p>
+        </w:tc>
+        <w:tc>
+          <w:tcPr>
+            <w:tcW w:type="dxa" w:w="1234"/>
+          </w:tcPr>
+          <w:p>
+            <w:r>
+              <w:t>str</w:t>
+            </w:r>
+          </w:p>
+        </w:tc>
+        <w:tc>
+          <w:tcPr>
+            <w:tcW w:type="dxa" w:w="1234"/>
+          </w:tcPr>
+          <w:p>
+            <w:pPr>
+              <w:jc w:val="right"/>
+            </w:pPr>
+            <w:r>
+              <w:t>4</w:t>
+            </w:r>
+          </w:p>
+        </w:tc>
+        <w:tc>
+          <w:tcPr>
+            <w:tcW w:type="dxa" w:w="1234"/>
+          </w:tcPr>
+          <w:p>
+            <w:pPr>
+              <w:jc w:val="right"/>
+            </w:pPr>
+            <w:r>
+              <w:t>336,038</w:t>
+            </w:r>
+          </w:p>
+        </w:tc>
+        <w:tc>
+          <w:tcPr>
+            <w:tcW w:type="dxa" w:w="1234"/>
+          </w:tcPr>
+          <w:p>
+            <w:pPr>
+              <w:jc w:val="right"/>
+            </w:pPr>
+            <w:r>
+              <w:t>100.0%</w:t>
+            </w:r>
+          </w:p>
+        </w:tc>
+      </w:tr>
+      <w:tr>
+        <w:tc>
+          <w:tcPr>
+            <w:tcW w:type="dxa" w:w="1234"/>
+          </w:tcPr>
+          <w:p>
+            <w:r>
+              <w:t>Age of Mother</w:t>
+            </w:r>
+          </w:p>
+        </w:tc>
+        <w:tc>
+          <w:tcPr>
+            <w:tcW w:type="dxa" w:w="1234"/>
+          </w:tcPr>
+          <w:p>
+            <w:pPr>
+              <w:jc w:val="right"/>
+            </w:pPr>
+            <w:r>
+              <w:t>59</w:t>
+            </w:r>
+          </w:p>
+        </w:tc>
+        <w:tc>
+          <w:tcPr>
+            <w:tcW w:type="dxa" w:w="1234"/>
+          </w:tcPr>
+          <w:p>
+            <w:pPr>
+              <w:jc w:val="right"/>
+            </w:pPr>
+            <w:r>
+              <w:t>0.0%</w:t>
+            </w:r>
+          </w:p>
+        </w:tc>
+        <w:tc>
+          <w:tcPr>
+            <w:tcW w:type="dxa" w:w="1234"/>
+          </w:tcPr>
+          <w:p>
+            <w:r>
+              <w:t>float64</w:t>
+            </w:r>
+          </w:p>
+        </w:tc>
+        <w:tc>
+          <w:tcPr>
+            <w:tcW w:type="dxa" w:w="1234"/>
+          </w:tcPr>
+          <w:p>
+            <w:pPr>
+              <w:jc w:val="right"/>
+            </w:pPr>
+            <w:r>
+              <w:t>41</w:t>
+            </w:r>
+          </w:p>
+        </w:tc>
+        <w:tc>
+          <w:tcPr>
+            <w:tcW w:type="dxa" w:w="1234"/>
+          </w:tcPr>
+          <w:p>
+            <w:pPr>
+              <w:jc w:val="right"/>
+            </w:pPr>
+            <w:r>
+              <w:t>336,038</w:t>
+            </w:r>
+          </w:p>
+        </w:tc>
+        <w:tc>
+          <w:tcPr>
+            <w:tcW w:type="dxa" w:w="1234"/>
+          </w:tcPr>
+          <w:p>
+            <w:pPr>
+              <w:jc w:val="right"/>
+            </w:pPr>
+            <w:r>
+              <w:t>100.0%</w:t>
+            </w:r>
+          </w:p>
+        </w:tc>
+      </w:tr>
+      <w:tr>
+        <w:tc>
+          <w:tcPr>
+            <w:tcW w:type="dxa" w:w="1234"/>
+          </w:tcPr>
+          <w:p>
+            <w:r>
+              <w:t>Marital_Status</w:t>
+            </w:r>
+          </w:p>
+        </w:tc>
+        <w:tc>
+          <w:tcPr>
+            <w:tcW w:type="dxa" w:w="1234"/>
+          </w:tcPr>
+          <w:p>
+            <w:pPr>
+              <w:jc w:val="right"/>
+            </w:pPr>
+            <w:r>
+              <w:t>59</w:t>
+            </w:r>
+          </w:p>
+        </w:tc>
+        <w:tc>
+          <w:tcPr>
+            <w:tcW w:type="dxa" w:w="1234"/>
+          </w:tcPr>
+          <w:p>
+            <w:pPr>
+              <w:jc w:val="right"/>
+            </w:pPr>
+            <w:r>
+              <w:t>0.0%</w:t>
+            </w:r>
+          </w:p>
+        </w:tc>
+        <w:tc>
+          <w:tcPr>
+            <w:tcW w:type="dxa" w:w="1234"/>
+          </w:tcPr>
+          <w:p>
+            <w:r>
+              <w:t>str</w:t>
+            </w:r>
+          </w:p>
+        </w:tc>
+        <w:tc>
+          <w:tcPr>
+            <w:tcW w:type="dxa" w:w="1234"/>
+          </w:tcPr>
+          <w:p>
+            <w:pPr>
+              <w:jc w:val="right"/>
+            </w:pPr>
+            <w:r>
+              <w:t>2</w:t>
+            </w:r>
+          </w:p>
+        </w:tc>
+        <w:tc>
+          <w:tcPr>
+            <w:tcW w:type="dxa" w:w="1234"/>
+          </w:tcPr>
+          <w:p>
+            <w:pPr>
+              <w:jc w:val="right"/>
+            </w:pPr>
+            <w:r>
+              <w:t>336,038</w:t>
+            </w:r>
+          </w:p>
+        </w:tc>
+        <w:tc>
+          <w:tcPr>
+            <w:tcW w:type="dxa" w:w="1234"/>
+          </w:tcPr>
+          <w:p>
+            <w:pPr>
+              <w:jc w:val="right"/>
+            </w:pPr>
+            <w:r>
+              <w:t>100.0%</w:t>
+            </w:r>
+          </w:p>
+        </w:tc>
+      </w:tr>
+      <w:tr>
+        <w:tc>
+          <w:tcPr>
+            <w:tcW w:type="dxa" w:w="1234"/>
+          </w:tcPr>
+          <w:p>
+            <w:r>
+              <w:t>District_of_Mother</w:t>
+            </w:r>
+          </w:p>
+        </w:tc>
+        <w:tc>
+          <w:tcPr>
+            <w:tcW w:type="dxa" w:w="1234"/>
+          </w:tcPr>
+          <w:p>
+            <w:pPr>
+              <w:jc w:val="right"/>
+            </w:pPr>
+            <w:r>
+              <w:t>59</w:t>
+            </w:r>
+          </w:p>
+        </w:tc>
+        <w:tc>
+          <w:tcPr>
+            <w:tcW w:type="dxa" w:w="1234"/>
+          </w:tcPr>
+          <w:p>
+            <w:pPr>
+              <w:jc w:val="right"/>
+            </w:pPr>
+            <w:r>
+              <w:t>0.0%</w:t>
+            </w:r>
+          </w:p>
+        </w:tc>
+        <w:tc>
+          <w:tcPr>
+            <w:tcW w:type="dxa" w:w="1234"/>
+          </w:tcPr>
+          <w:p>
+            <w:r>
+              <w:t>str</w:t>
+            </w:r>
+          </w:p>
+        </w:tc>
+        <w:tc>
+          <w:tcPr>
+            <w:tcW w:type="dxa" w:w="1234"/>
+          </w:tcPr>
+          <w:p>
+            <w:pPr>
+              <w:jc w:val="right"/>
+            </w:pPr>
+            <w:r>
+              <w:t>25</w:t>
+            </w:r>
+          </w:p>
+        </w:tc>
+        <w:tc>
+          <w:tcPr>
+            <w:tcW w:type="dxa" w:w="1234"/>
+          </w:tcPr>
+          <w:p>
+            <w:pPr>
+              <w:jc w:val="right"/>
+            </w:pPr>
+            <w:r>
+              <w:t>336,038</w:t>
+            </w:r>
+          </w:p>
+        </w:tc>
+        <w:tc>
+          <w:tcPr>
+            <w:tcW w:type="dxa" w:w="1234"/>
+          </w:tcPr>
+          <w:p>
+            <w:pPr>
+              <w:jc w:val="right"/>
+            </w:pPr>
+            <w:r>
+              <w:t>100.0%</w:t>
+            </w:r>
+          </w:p>
+        </w:tc>
+      </w:tr>
+      <w:tr>
+        <w:tc>
+          <w:tcPr>
+            <w:tcW w:type="dxa" w:w="1234"/>
+          </w:tcPr>
+          <w:p>
+            <w:r>
+              <w:t>Race_of_Mother</w:t>
+            </w:r>
+          </w:p>
+        </w:tc>
+        <w:tc>
+          <w:tcPr>
+            <w:tcW w:type="dxa" w:w="1234"/>
+          </w:tcPr>
+          <w:p>
+            <w:pPr>
+              <w:jc w:val="right"/>
+            </w:pPr>
+            <w:r>
+              <w:t>59</w:t>
             </w:r>
           </w:p>
         </w:tc>
@@ -1219,703 +1828,7 @@
               <w:jc w:val="right"/>
             </w:pPr>
             <w:r>
-              <w:t>336,097</w:t>
-            </w:r>
-          </w:p>
-        </w:tc>
-        <w:tc>
-          <w:tcPr>
-            <w:tcW w:type="dxa" w:w="1234"/>
-          </w:tcPr>
-          <w:p>
-            <w:pPr>
-              <w:jc w:val="right"/>
-            </w:pPr>
-            <w:r>
-              <w:t>100.0%</w:t>
-            </w:r>
-          </w:p>
-        </w:tc>
-      </w:tr>
-      <w:tr>
-        <w:tc>
-          <w:tcPr>
-            <w:tcW w:type="dxa" w:w="1234"/>
-          </w:tcPr>
-          <w:p>
-            <w:r>
-              <w:t>TWIN</w:t>
-            </w:r>
-          </w:p>
-        </w:tc>
-        <w:tc>
-          <w:tcPr>
-            <w:tcW w:type="dxa" w:w="1234"/>
-          </w:tcPr>
-          <w:p>
-            <w:pPr>
-              <w:jc w:val="right"/>
-            </w:pPr>
-            <w:r>
-              <w:t>0</w:t>
-            </w:r>
-          </w:p>
-        </w:tc>
-        <w:tc>
-          <w:tcPr>
-            <w:tcW w:type="dxa" w:w="1234"/>
-          </w:tcPr>
-          <w:p>
-            <w:pPr>
-              <w:jc w:val="right"/>
-            </w:pPr>
-            <w:r>
-              <w:t>0.0%</w:t>
-            </w:r>
-          </w:p>
-        </w:tc>
-        <w:tc>
-          <w:tcPr>
-            <w:tcW w:type="dxa" w:w="1234"/>
-          </w:tcPr>
-          <w:p>
-            <w:r>
-              <w:t>int64</w:t>
-            </w:r>
-          </w:p>
-        </w:tc>
-        <w:tc>
-          <w:tcPr>
-            <w:tcW w:type="dxa" w:w="1234"/>
-          </w:tcPr>
-          <w:p>
-            <w:pPr>
-              <w:jc w:val="right"/>
-            </w:pPr>
-            <w:r>
-              <w:t>4</w:t>
-            </w:r>
-          </w:p>
-        </w:tc>
-        <w:tc>
-          <w:tcPr>
-            <w:tcW w:type="dxa" w:w="1234"/>
-          </w:tcPr>
-          <w:p>
-            <w:pPr>
-              <w:jc w:val="right"/>
-            </w:pPr>
-            <w:r>
-              <w:t>336,097</w:t>
-            </w:r>
-          </w:p>
-        </w:tc>
-        <w:tc>
-          <w:tcPr>
-            <w:tcW w:type="dxa" w:w="1234"/>
-          </w:tcPr>
-          <w:p>
-            <w:pPr>
-              <w:jc w:val="right"/>
-            </w:pPr>
-            <w:r>
-              <w:t>100.0%</w:t>
-            </w:r>
-          </w:p>
-        </w:tc>
-      </w:tr>
-      <w:tr>
-        <w:tc>
-          <w:tcPr>
-            <w:tcW w:type="dxa" w:w="1234"/>
-          </w:tcPr>
-          <w:p>
-            <w:r>
-              <w:t>Hospital or Not</w:t>
-            </w:r>
-          </w:p>
-        </w:tc>
-        <w:tc>
-          <w:tcPr>
-            <w:tcW w:type="dxa" w:w="1234"/>
-          </w:tcPr>
-          <w:p>
-            <w:pPr>
-              <w:jc w:val="right"/>
-            </w:pPr>
-            <w:r>
-              <w:t>0</w:t>
-            </w:r>
-          </w:p>
-        </w:tc>
-        <w:tc>
-          <w:tcPr>
-            <w:tcW w:type="dxa" w:w="1234"/>
-          </w:tcPr>
-          <w:p>
-            <w:pPr>
-              <w:jc w:val="right"/>
-            </w:pPr>
-            <w:r>
-              <w:t>0.0%</w:t>
-            </w:r>
-          </w:p>
-        </w:tc>
-        <w:tc>
-          <w:tcPr>
-            <w:tcW w:type="dxa" w:w="1234"/>
-          </w:tcPr>
-          <w:p>
-            <w:r>
-              <w:t>str</w:t>
-            </w:r>
-          </w:p>
-        </w:tc>
-        <w:tc>
-          <w:tcPr>
-            <w:tcW w:type="dxa" w:w="1234"/>
-          </w:tcPr>
-          <w:p>
-            <w:pPr>
-              <w:jc w:val="right"/>
-            </w:pPr>
-            <w:r>
-              <w:t>2</w:t>
-            </w:r>
-          </w:p>
-        </w:tc>
-        <w:tc>
-          <w:tcPr>
-            <w:tcW w:type="dxa" w:w="1234"/>
-          </w:tcPr>
-          <w:p>
-            <w:pPr>
-              <w:jc w:val="right"/>
-            </w:pPr>
-            <w:r>
-              <w:t>336,097</w:t>
-            </w:r>
-          </w:p>
-        </w:tc>
-        <w:tc>
-          <w:tcPr>
-            <w:tcW w:type="dxa" w:w="1234"/>
-          </w:tcPr>
-          <w:p>
-            <w:pPr>
-              <w:jc w:val="right"/>
-            </w:pPr>
-            <w:r>
-              <w:t>100.0%</w:t>
-            </w:r>
-          </w:p>
-        </w:tc>
-      </w:tr>
-      <w:tr>
-        <w:tc>
-          <w:tcPr>
-            <w:tcW w:type="dxa" w:w="1234"/>
-          </w:tcPr>
-          <w:p>
-            <w:r>
-              <w:t>Gender</w:t>
-            </w:r>
-          </w:p>
-        </w:tc>
-        <w:tc>
-          <w:tcPr>
-            <w:tcW w:type="dxa" w:w="1234"/>
-          </w:tcPr>
-          <w:p>
-            <w:pPr>
-              <w:jc w:val="right"/>
-            </w:pPr>
-            <w:r>
-              <w:t>0</w:t>
-            </w:r>
-          </w:p>
-        </w:tc>
-        <w:tc>
-          <w:tcPr>
-            <w:tcW w:type="dxa" w:w="1234"/>
-          </w:tcPr>
-          <w:p>
-            <w:pPr>
-              <w:jc w:val="right"/>
-            </w:pPr>
-            <w:r>
-              <w:t>0.0%</w:t>
-            </w:r>
-          </w:p>
-        </w:tc>
-        <w:tc>
-          <w:tcPr>
-            <w:tcW w:type="dxa" w:w="1234"/>
-          </w:tcPr>
-          <w:p>
-            <w:r>
-              <w:t>str</w:t>
-            </w:r>
-          </w:p>
-        </w:tc>
-        <w:tc>
-          <w:tcPr>
-            <w:tcW w:type="dxa" w:w="1234"/>
-          </w:tcPr>
-          <w:p>
-            <w:pPr>
-              <w:jc w:val="right"/>
-            </w:pPr>
-            <w:r>
-              <w:t>2</w:t>
-            </w:r>
-          </w:p>
-        </w:tc>
-        <w:tc>
-          <w:tcPr>
-            <w:tcW w:type="dxa" w:w="1234"/>
-          </w:tcPr>
-          <w:p>
-            <w:pPr>
-              <w:jc w:val="right"/>
-            </w:pPr>
-            <w:r>
-              <w:t>336,097</w:t>
-            </w:r>
-          </w:p>
-        </w:tc>
-        <w:tc>
-          <w:tcPr>
-            <w:tcW w:type="dxa" w:w="1234"/>
-          </w:tcPr>
-          <w:p>
-            <w:pPr>
-              <w:jc w:val="right"/>
-            </w:pPr>
-            <w:r>
-              <w:t>100.0%</w:t>
-            </w:r>
-          </w:p>
-        </w:tc>
-      </w:tr>
-      <w:tr>
-        <w:tc>
-          <w:tcPr>
-            <w:tcW w:type="dxa" w:w="1234"/>
-          </w:tcPr>
-          <w:p>
-            <w:r>
-              <w:t>Multiple_Birth_Status</w:t>
-            </w:r>
-          </w:p>
-        </w:tc>
-        <w:tc>
-          <w:tcPr>
-            <w:tcW w:type="dxa" w:w="1234"/>
-          </w:tcPr>
-          <w:p>
-            <w:pPr>
-              <w:jc w:val="right"/>
-            </w:pPr>
-            <w:r>
-              <w:t>0</w:t>
-            </w:r>
-          </w:p>
-        </w:tc>
-        <w:tc>
-          <w:tcPr>
-            <w:tcW w:type="dxa" w:w="1234"/>
-          </w:tcPr>
-          <w:p>
-            <w:pPr>
-              <w:jc w:val="right"/>
-            </w:pPr>
-            <w:r>
-              <w:t>0.0%</w:t>
-            </w:r>
-          </w:p>
-        </w:tc>
-        <w:tc>
-          <w:tcPr>
-            <w:tcW w:type="dxa" w:w="1234"/>
-          </w:tcPr>
-          <w:p>
-            <w:r>
-              <w:t>str</w:t>
-            </w:r>
-          </w:p>
-        </w:tc>
-        <w:tc>
-          <w:tcPr>
-            <w:tcW w:type="dxa" w:w="1234"/>
-          </w:tcPr>
-          <w:p>
-            <w:pPr>
-              <w:jc w:val="right"/>
-            </w:pPr>
-            <w:r>
-              <w:t>4</w:t>
-            </w:r>
-          </w:p>
-        </w:tc>
-        <w:tc>
-          <w:tcPr>
-            <w:tcW w:type="dxa" w:w="1234"/>
-          </w:tcPr>
-          <w:p>
-            <w:pPr>
-              <w:jc w:val="right"/>
-            </w:pPr>
-            <w:r>
-              <w:t>336,097</w:t>
-            </w:r>
-          </w:p>
-        </w:tc>
-        <w:tc>
-          <w:tcPr>
-            <w:tcW w:type="dxa" w:w="1234"/>
-          </w:tcPr>
-          <w:p>
-            <w:pPr>
-              <w:jc w:val="right"/>
-            </w:pPr>
-            <w:r>
-              <w:t>100.0%</w:t>
-            </w:r>
-          </w:p>
-        </w:tc>
-      </w:tr>
-      <w:tr>
-        <w:tc>
-          <w:tcPr>
-            <w:tcW w:type="dxa" w:w="1234"/>
-          </w:tcPr>
-          <w:p>
-            <w:r>
-              <w:t>Age of Mother</w:t>
-            </w:r>
-          </w:p>
-        </w:tc>
-        <w:tc>
-          <w:tcPr>
-            <w:tcW w:type="dxa" w:w="1234"/>
-          </w:tcPr>
-          <w:p>
-            <w:pPr>
-              <w:jc w:val="right"/>
-            </w:pPr>
-            <w:r>
-              <w:t>0</w:t>
-            </w:r>
-          </w:p>
-        </w:tc>
-        <w:tc>
-          <w:tcPr>
-            <w:tcW w:type="dxa" w:w="1234"/>
-          </w:tcPr>
-          <w:p>
-            <w:pPr>
-              <w:jc w:val="right"/>
-            </w:pPr>
-            <w:r>
-              <w:t>0.0%</w:t>
-            </w:r>
-          </w:p>
-        </w:tc>
-        <w:tc>
-          <w:tcPr>
-            <w:tcW w:type="dxa" w:w="1234"/>
-          </w:tcPr>
-          <w:p>
-            <w:r>
-              <w:t>int64</w:t>
-            </w:r>
-          </w:p>
-        </w:tc>
-        <w:tc>
-          <w:tcPr>
-            <w:tcW w:type="dxa" w:w="1234"/>
-          </w:tcPr>
-          <w:p>
-            <w:pPr>
-              <w:jc w:val="right"/>
-            </w:pPr>
-            <w:r>
-              <w:t>41</w:t>
-            </w:r>
-          </w:p>
-        </w:tc>
-        <w:tc>
-          <w:tcPr>
-            <w:tcW w:type="dxa" w:w="1234"/>
-          </w:tcPr>
-          <w:p>
-            <w:pPr>
-              <w:jc w:val="right"/>
-            </w:pPr>
-            <w:r>
-              <w:t>336,097</w:t>
-            </w:r>
-          </w:p>
-        </w:tc>
-        <w:tc>
-          <w:tcPr>
-            <w:tcW w:type="dxa" w:w="1234"/>
-          </w:tcPr>
-          <w:p>
-            <w:pPr>
-              <w:jc w:val="right"/>
-            </w:pPr>
-            <w:r>
-              <w:t>100.0%</w:t>
-            </w:r>
-          </w:p>
-        </w:tc>
-      </w:tr>
-      <w:tr>
-        <w:tc>
-          <w:tcPr>
-            <w:tcW w:type="dxa" w:w="1234"/>
-          </w:tcPr>
-          <w:p>
-            <w:r>
-              <w:t>Marital_Status</w:t>
-            </w:r>
-          </w:p>
-        </w:tc>
-        <w:tc>
-          <w:tcPr>
-            <w:tcW w:type="dxa" w:w="1234"/>
-          </w:tcPr>
-          <w:p>
-            <w:pPr>
-              <w:jc w:val="right"/>
-            </w:pPr>
-            <w:r>
-              <w:t>0</w:t>
-            </w:r>
-          </w:p>
-        </w:tc>
-        <w:tc>
-          <w:tcPr>
-            <w:tcW w:type="dxa" w:w="1234"/>
-          </w:tcPr>
-          <w:p>
-            <w:pPr>
-              <w:jc w:val="right"/>
-            </w:pPr>
-            <w:r>
-              <w:t>0.0%</w:t>
-            </w:r>
-          </w:p>
-        </w:tc>
-        <w:tc>
-          <w:tcPr>
-            <w:tcW w:type="dxa" w:w="1234"/>
-          </w:tcPr>
-          <w:p>
-            <w:r>
-              <w:t>str</w:t>
-            </w:r>
-          </w:p>
-        </w:tc>
-        <w:tc>
-          <w:tcPr>
-            <w:tcW w:type="dxa" w:w="1234"/>
-          </w:tcPr>
-          <w:p>
-            <w:pPr>
-              <w:jc w:val="right"/>
-            </w:pPr>
-            <w:r>
-              <w:t>2</w:t>
-            </w:r>
-          </w:p>
-        </w:tc>
-        <w:tc>
-          <w:tcPr>
-            <w:tcW w:type="dxa" w:w="1234"/>
-          </w:tcPr>
-          <w:p>
-            <w:pPr>
-              <w:jc w:val="right"/>
-            </w:pPr>
-            <w:r>
-              <w:t>336,097</w:t>
-            </w:r>
-          </w:p>
-        </w:tc>
-        <w:tc>
-          <w:tcPr>
-            <w:tcW w:type="dxa" w:w="1234"/>
-          </w:tcPr>
-          <w:p>
-            <w:pPr>
-              <w:jc w:val="right"/>
-            </w:pPr>
-            <w:r>
-              <w:t>100.0%</w:t>
-            </w:r>
-          </w:p>
-        </w:tc>
-      </w:tr>
-      <w:tr>
-        <w:tc>
-          <w:tcPr>
-            <w:tcW w:type="dxa" w:w="1234"/>
-          </w:tcPr>
-          <w:p>
-            <w:r>
-              <w:t>District_of_Mother</w:t>
-            </w:r>
-          </w:p>
-        </w:tc>
-        <w:tc>
-          <w:tcPr>
-            <w:tcW w:type="dxa" w:w="1234"/>
-          </w:tcPr>
-          <w:p>
-            <w:pPr>
-              <w:jc w:val="right"/>
-            </w:pPr>
-            <w:r>
-              <w:t>0</w:t>
-            </w:r>
-          </w:p>
-        </w:tc>
-        <w:tc>
-          <w:tcPr>
-            <w:tcW w:type="dxa" w:w="1234"/>
-          </w:tcPr>
-          <w:p>
-            <w:pPr>
-              <w:jc w:val="right"/>
-            </w:pPr>
-            <w:r>
-              <w:t>0.0%</w:t>
-            </w:r>
-          </w:p>
-        </w:tc>
-        <w:tc>
-          <w:tcPr>
-            <w:tcW w:type="dxa" w:w="1234"/>
-          </w:tcPr>
-          <w:p>
-            <w:r>
-              <w:t>str</w:t>
-            </w:r>
-          </w:p>
-        </w:tc>
-        <w:tc>
-          <w:tcPr>
-            <w:tcW w:type="dxa" w:w="1234"/>
-          </w:tcPr>
-          <w:p>
-            <w:pPr>
-              <w:jc w:val="right"/>
-            </w:pPr>
-            <w:r>
-              <w:t>26</w:t>
-            </w:r>
-          </w:p>
-        </w:tc>
-        <w:tc>
-          <w:tcPr>
-            <w:tcW w:type="dxa" w:w="1234"/>
-          </w:tcPr>
-          <w:p>
-            <w:pPr>
-              <w:jc w:val="right"/>
-            </w:pPr>
-            <w:r>
-              <w:t>336,097</w:t>
-            </w:r>
-          </w:p>
-        </w:tc>
-        <w:tc>
-          <w:tcPr>
-            <w:tcW w:type="dxa" w:w="1234"/>
-          </w:tcPr>
-          <w:p>
-            <w:pPr>
-              <w:jc w:val="right"/>
-            </w:pPr>
-            <w:r>
-              <w:t>100.0%</w:t>
-            </w:r>
-          </w:p>
-        </w:tc>
-      </w:tr>
-      <w:tr>
-        <w:tc>
-          <w:tcPr>
-            <w:tcW w:type="dxa" w:w="1234"/>
-          </w:tcPr>
-          <w:p>
-            <w:r>
-              <w:t>Race_of_Mother</w:t>
-            </w:r>
-          </w:p>
-        </w:tc>
-        <w:tc>
-          <w:tcPr>
-            <w:tcW w:type="dxa" w:w="1234"/>
-          </w:tcPr>
-          <w:p>
-            <w:pPr>
-              <w:jc w:val="right"/>
-            </w:pPr>
-            <w:r>
-              <w:t>0</w:t>
-            </w:r>
-          </w:p>
-        </w:tc>
-        <w:tc>
-          <w:tcPr>
-            <w:tcW w:type="dxa" w:w="1234"/>
-          </w:tcPr>
-          <w:p>
-            <w:pPr>
-              <w:jc w:val="right"/>
-            </w:pPr>
-            <w:r>
-              <w:t>0.0%</w:t>
-            </w:r>
-          </w:p>
-        </w:tc>
-        <w:tc>
-          <w:tcPr>
-            <w:tcW w:type="dxa" w:w="1234"/>
-          </w:tcPr>
-          <w:p>
-            <w:r>
-              <w:t>str</w:t>
-            </w:r>
-          </w:p>
-        </w:tc>
-        <w:tc>
-          <w:tcPr>
-            <w:tcW w:type="dxa" w:w="1234"/>
-          </w:tcPr>
-          <w:p>
-            <w:pPr>
-              <w:jc w:val="right"/>
-            </w:pPr>
-            <w:r>
-              <w:t>12</w:t>
-            </w:r>
-          </w:p>
-        </w:tc>
-        <w:tc>
-          <w:tcPr>
-            <w:tcW w:type="dxa" w:w="1234"/>
-          </w:tcPr>
-          <w:p>
-            <w:pPr>
-              <w:jc w:val="right"/>
-            </w:pPr>
-            <w:r>
-              <w:t>336,097</w:t>
+              <w:t>336,038</w:t>
             </w:r>
           </w:p>
         </w:tc>
@@ -1946,7 +1859,7 @@
       <w:r>
         <w:drawing>
           <wp:inline xmlns:a="http://schemas.openxmlformats.org/drawingml/2006/main" xmlns:pic="http://schemas.openxmlformats.org/drawingml/2006/picture">
-            <wp:extent cx="5943600" cy="4202712"/>
+            <wp:extent cx="5943600" cy="4037612"/>
             <wp:docPr id="1" name="Picture 1"/>
             <wp:cNvGraphicFramePr>
               <a:graphicFrameLocks noChangeAspect="1"/>
@@ -1967,7 +1880,7 @@
                   <pic:spPr>
                     <a:xfrm>
                       <a:off x="0" y="0"/>
-                      <a:ext cx="5943600" cy="4202712"/>
+                      <a:ext cx="5943600" cy="4037612"/>
                     </a:xfrm>
                     <a:prstGeom prst="rect"/>
                   </pic:spPr>
@@ -2103,7 +2016,7 @@
       <w:jc w:val="center"/>
     </w:pPr>
     <w:r>
-      <w:t xml:space="preserve">Missing Values Analysis | Generated: 2026-04-01 | Page </w:t>
+      <w:t xml:space="preserve">Missing Values Analysis | Generated: 2026-04-30 | Page </w:t>
     </w:r>
     <w:r>
       <w:fldChar w:fldCharType="begin"/>

</xml_diff>